<commit_message>
Fix timetable break after 4th period
</commit_message>
<xml_diff>
--- a/ABDUL SALAM_timetable.docx
+++ b/ABDUL SALAM_timetable.docx
@@ -22,92 +22,116 @@
         <w:tblLook w:firstColumn="1" w:firstRow="1" w:lastColumn="0" w:lastRow="0" w:noHBand="0" w:noVBand="1" w:val="04A0"/>
       </w:tblPr>
       <w:tblGrid>
-        <w:gridCol w:w="1080"/>
-        <w:gridCol w:w="1080"/>
-        <w:gridCol w:w="1080"/>
-        <w:gridCol w:w="1080"/>
-        <w:gridCol w:w="1080"/>
-        <w:gridCol w:w="1080"/>
-        <w:gridCol w:w="1080"/>
-        <w:gridCol w:w="1080"/>
+        <w:gridCol w:w="1530"/>
+        <w:gridCol w:w="1530"/>
+        <w:gridCol w:w="1530"/>
+        <w:gridCol w:w="1530"/>
+        <w:gridCol w:w="1530"/>
+        <w:gridCol w:w="1530"/>
+        <w:gridCol w:w="1530"/>
+        <w:gridCol w:w="1530"/>
       </w:tblGrid>
       <w:tr>
         <w:tc>
           <w:tcPr>
-            <w:tcW w:type="dxa" w:w="1080"/>
+            <w:tcW w:type="dxa" w:w="1530"/>
           </w:tcPr>
           <w:p>
             <w:r>
+              <w:rPr>
+                <w:b/>
+              </w:rPr>
               <w:t>Period</w:t>
             </w:r>
           </w:p>
         </w:tc>
         <w:tc>
           <w:tcPr>
-            <w:tcW w:type="dxa" w:w="1080"/>
+            <w:tcW w:type="dxa" w:w="1530"/>
           </w:tcPr>
           <w:p>
             <w:r>
-              <w:t>Mon-Thu Time</w:t>
+              <w:rPr>
+                <w:b/>
+              </w:rPr>
+              <w:t>Mon-Wed Time</w:t>
             </w:r>
           </w:p>
         </w:tc>
         <w:tc>
           <w:tcPr>
-            <w:tcW w:type="dxa" w:w="1080"/>
+            <w:tcW w:type="dxa" w:w="1530"/>
           </w:tcPr>
           <w:p>
             <w:r>
+              <w:rPr>
+                <w:b/>
+              </w:rPr>
               <w:t>Mon</w:t>
             </w:r>
           </w:p>
         </w:tc>
         <w:tc>
           <w:tcPr>
-            <w:tcW w:type="dxa" w:w="1080"/>
+            <w:tcW w:type="dxa" w:w="1530"/>
           </w:tcPr>
           <w:p>
             <w:r>
+              <w:rPr>
+                <w:b/>
+              </w:rPr>
               <w:t>Tue</w:t>
             </w:r>
           </w:p>
         </w:tc>
         <w:tc>
           <w:tcPr>
-            <w:tcW w:type="dxa" w:w="1080"/>
+            <w:tcW w:type="dxa" w:w="1530"/>
           </w:tcPr>
           <w:p>
             <w:r>
+              <w:rPr>
+                <w:b/>
+              </w:rPr>
               <w:t>Wed</w:t>
             </w:r>
           </w:p>
         </w:tc>
         <w:tc>
           <w:tcPr>
-            <w:tcW w:type="dxa" w:w="1080"/>
+            <w:tcW w:type="dxa" w:w="1530"/>
           </w:tcPr>
           <w:p>
             <w:r>
+              <w:rPr>
+                <w:b/>
+              </w:rPr>
               <w:t>Thu</w:t>
             </w:r>
           </w:p>
         </w:tc>
         <w:tc>
           <w:tcPr>
-            <w:tcW w:type="dxa" w:w="1080"/>
+            <w:tcW w:type="dxa" w:w="1530"/>
           </w:tcPr>
           <w:p>
             <w:r>
+              <w:rPr>
+                <w:b/>
+              </w:rPr>
               <w:t>Fri</w:t>
             </w:r>
           </w:p>
         </w:tc>
         <w:tc>
           <w:tcPr>
-            <w:tcW w:type="dxa" w:w="1080"/>
+            <w:tcW w:type="dxa" w:w="1530"/>
           </w:tcPr>
           <w:p>
             <w:r>
+              <w:rPr>
+                <w:b/>
+              </w:rPr>
               <w:t>Fri Time</w:t>
             </w:r>
           </w:p>
@@ -116,7 +140,7 @@
       <w:tr>
         <w:tc>
           <w:tcPr>
-            <w:tcW w:type="dxa" w:w="1080"/>
+            <w:tcW w:type="dxa" w:w="1530"/>
           </w:tcPr>
           <w:p>
             <w:r>
@@ -126,7 +150,7 @@
         </w:tc>
         <w:tc>
           <w:tcPr>
-            <w:tcW w:type="dxa" w:w="1080"/>
+            <w:tcW w:type="dxa" w:w="1530"/>
           </w:tcPr>
           <w:p>
             <w:r>
@@ -136,7 +160,7 @@
         </w:tc>
         <w:tc>
           <w:tcPr>
-            <w:tcW w:type="dxa" w:w="1080"/>
+            <w:tcW w:type="dxa" w:w="1530"/>
           </w:tcPr>
           <w:p>
             <w:r/>
@@ -144,7 +168,7 @@
         </w:tc>
         <w:tc>
           <w:tcPr>
-            <w:tcW w:type="dxa" w:w="1080"/>
+            <w:tcW w:type="dxa" w:w="1530"/>
           </w:tcPr>
           <w:p>
             <w:r/>
@@ -152,7 +176,7 @@
         </w:tc>
         <w:tc>
           <w:tcPr>
-            <w:tcW w:type="dxa" w:w="1080"/>
+            <w:tcW w:type="dxa" w:w="1530"/>
           </w:tcPr>
           <w:p>
             <w:r/>
@@ -160,7 +184,383 @@
         </w:tc>
         <w:tc>
           <w:tcPr>
-            <w:tcW w:type="dxa" w:w="1080"/>
+            <w:tcW w:type="dxa" w:w="1530"/>
+          </w:tcPr>
+          <w:p>
+            <w:r/>
+          </w:p>
+        </w:tc>
+        <w:tc>
+          <w:tcPr>
+            <w:tcW w:type="dxa" w:w="1530"/>
+          </w:tcPr>
+          <w:p>
+            <w:r>
+              <w:t>7E</w:t>
+              <w:br/>
+              <w:t>ARABIC</w:t>
+            </w:r>
+          </w:p>
+        </w:tc>
+        <w:tc>
+          <w:tcPr>
+            <w:tcW w:type="dxa" w:w="1530"/>
+          </w:tcPr>
+          <w:p>
+            <w:r>
+              <w:t>8:00-8:40</w:t>
+            </w:r>
+          </w:p>
+        </w:tc>
+      </w:tr>
+      <w:tr>
+        <w:tc>
+          <w:tcPr>
+            <w:tcW w:type="dxa" w:w="1530"/>
+          </w:tcPr>
+          <w:p>
+            <w:r>
+              <w:t>P2</w:t>
+            </w:r>
+          </w:p>
+        </w:tc>
+        <w:tc>
+          <w:tcPr>
+            <w:tcW w:type="dxa" w:w="1530"/>
+          </w:tcPr>
+          <w:p>
+            <w:r>
+              <w:t>8:50-9:30</w:t>
+            </w:r>
+          </w:p>
+        </w:tc>
+        <w:tc>
+          <w:tcPr>
+            <w:tcW w:type="dxa" w:w="1530"/>
+          </w:tcPr>
+          <w:p>
+            <w:r>
+              <w:t>6E</w:t>
+              <w:br/>
+              <w:t>ISLAMIAT</w:t>
+            </w:r>
+          </w:p>
+        </w:tc>
+        <w:tc>
+          <w:tcPr>
+            <w:tcW w:type="dxa" w:w="1530"/>
+          </w:tcPr>
+          <w:p>
+            <w:r/>
+          </w:p>
+        </w:tc>
+        <w:tc>
+          <w:tcPr>
+            <w:tcW w:type="dxa" w:w="1530"/>
+          </w:tcPr>
+          <w:p>
+            <w:r>
+              <w:t>6E</w:t>
+              <w:br/>
+              <w:t>ISLAMIAT</w:t>
+            </w:r>
+          </w:p>
+        </w:tc>
+        <w:tc>
+          <w:tcPr>
+            <w:tcW w:type="dxa" w:w="1530"/>
+          </w:tcPr>
+          <w:p>
+            <w:r>
+              <w:t>7E</w:t>
+              <w:br/>
+              <w:t>ARABIC</w:t>
+            </w:r>
+          </w:p>
+        </w:tc>
+        <w:tc>
+          <w:tcPr>
+            <w:tcW w:type="dxa" w:w="1530"/>
+          </w:tcPr>
+          <w:p>
+            <w:r/>
+          </w:p>
+        </w:tc>
+        <w:tc>
+          <w:tcPr>
+            <w:tcW w:type="dxa" w:w="1530"/>
+          </w:tcPr>
+          <w:p>
+            <w:r>
+              <w:t>8:40-9:15</w:t>
+            </w:r>
+          </w:p>
+        </w:tc>
+      </w:tr>
+      <w:tr>
+        <w:tc>
+          <w:tcPr>
+            <w:tcW w:type="dxa" w:w="1530"/>
+          </w:tcPr>
+          <w:p>
+            <w:r>
+              <w:t>P3</w:t>
+            </w:r>
+          </w:p>
+        </w:tc>
+        <w:tc>
+          <w:tcPr>
+            <w:tcW w:type="dxa" w:w="1530"/>
+          </w:tcPr>
+          <w:p>
+            <w:r>
+              <w:t>9:30-10:10</w:t>
+            </w:r>
+          </w:p>
+        </w:tc>
+        <w:tc>
+          <w:tcPr>
+            <w:tcW w:type="dxa" w:w="1530"/>
+          </w:tcPr>
+          <w:p>
+            <w:r/>
+          </w:p>
+        </w:tc>
+        <w:tc>
+          <w:tcPr>
+            <w:tcW w:type="dxa" w:w="1530"/>
+          </w:tcPr>
+          <w:p>
+            <w:r/>
+          </w:p>
+        </w:tc>
+        <w:tc>
+          <w:tcPr>
+            <w:tcW w:type="dxa" w:w="1530"/>
+          </w:tcPr>
+          <w:p>
+            <w:r/>
+          </w:p>
+        </w:tc>
+        <w:tc>
+          <w:tcPr>
+            <w:tcW w:type="dxa" w:w="1530"/>
+          </w:tcPr>
+          <w:p>
+            <w:r>
+              <w:t>7B</w:t>
+              <w:br/>
+              <w:t>ARABIC</w:t>
+            </w:r>
+          </w:p>
+        </w:tc>
+        <w:tc>
+          <w:tcPr>
+            <w:tcW w:type="dxa" w:w="1530"/>
+          </w:tcPr>
+          <w:p>
+            <w:r/>
+          </w:p>
+        </w:tc>
+        <w:tc>
+          <w:tcPr>
+            <w:tcW w:type="dxa" w:w="1530"/>
+          </w:tcPr>
+          <w:p>
+            <w:r>
+              <w:t>9:15-9:50</w:t>
+            </w:r>
+          </w:p>
+        </w:tc>
+      </w:tr>
+      <w:tr>
+        <w:tc>
+          <w:tcPr>
+            <w:tcW w:type="dxa" w:w="1530"/>
+          </w:tcPr>
+          <w:p>
+            <w:r>
+              <w:t>P4</w:t>
+            </w:r>
+          </w:p>
+        </w:tc>
+        <w:tc>
+          <w:tcPr>
+            <w:tcW w:type="dxa" w:w="1530"/>
+          </w:tcPr>
+          <w:p>
+            <w:r>
+              <w:t>10:10-10:50</w:t>
+            </w:r>
+          </w:p>
+        </w:tc>
+        <w:tc>
+          <w:tcPr>
+            <w:tcW w:type="dxa" w:w="1530"/>
+          </w:tcPr>
+          <w:p>
+            <w:r/>
+          </w:p>
+        </w:tc>
+        <w:tc>
+          <w:tcPr>
+            <w:tcW w:type="dxa" w:w="1530"/>
+          </w:tcPr>
+          <w:p>
+            <w:r/>
+          </w:p>
+        </w:tc>
+        <w:tc>
+          <w:tcPr>
+            <w:tcW w:type="dxa" w:w="1530"/>
+          </w:tcPr>
+          <w:p>
+            <w:r/>
+          </w:p>
+        </w:tc>
+        <w:tc>
+          <w:tcPr>
+            <w:tcW w:type="dxa" w:w="1530"/>
+          </w:tcPr>
+          <w:p>
+            <w:r>
+              <w:t>6E</w:t>
+              <w:br/>
+              <w:t>ISLAMIAT</w:t>
+            </w:r>
+          </w:p>
+        </w:tc>
+        <w:tc>
+          <w:tcPr>
+            <w:tcW w:type="dxa" w:w="1530"/>
+          </w:tcPr>
+          <w:p>
+            <w:r/>
+          </w:p>
+        </w:tc>
+        <w:tc>
+          <w:tcPr>
+            <w:tcW w:type="dxa" w:w="1530"/>
+          </w:tcPr>
+          <w:p>
+            <w:r>
+              <w:t>9:50-10:25</w:t>
+            </w:r>
+          </w:p>
+        </w:tc>
+      </w:tr>
+      <w:tr>
+        <w:tc>
+          <w:tcPr>
+            <w:tcW w:type="dxa" w:w="1530"/>
+          </w:tcPr>
+          <w:p>
+            <w:r>
+              <w:t>Lunch</w:t>
+            </w:r>
+          </w:p>
+        </w:tc>
+        <w:tc>
+          <w:tcPr>
+            <w:tcW w:type="dxa" w:w="1530"/>
+          </w:tcPr>
+          <w:p>
+            <w:r>
+              <w:t>10:50-11:20</w:t>
+            </w:r>
+          </w:p>
+        </w:tc>
+        <w:tc>
+          <w:tcPr>
+            <w:tcW w:type="dxa" w:w="1530"/>
+          </w:tcPr>
+          <w:p>
+            <w:r/>
+          </w:p>
+        </w:tc>
+        <w:tc>
+          <w:tcPr>
+            <w:tcW w:type="dxa" w:w="1530"/>
+          </w:tcPr>
+          <w:p>
+            <w:r/>
+          </w:p>
+        </w:tc>
+        <w:tc>
+          <w:tcPr>
+            <w:tcW w:type="dxa" w:w="1530"/>
+          </w:tcPr>
+          <w:p>
+            <w:r/>
+          </w:p>
+        </w:tc>
+        <w:tc>
+          <w:tcPr>
+            <w:tcW w:type="dxa" w:w="1530"/>
+          </w:tcPr>
+          <w:p>
+            <w:r/>
+          </w:p>
+        </w:tc>
+        <w:tc>
+          <w:tcPr>
+            <w:tcW w:type="dxa" w:w="1530"/>
+          </w:tcPr>
+          <w:p>
+            <w:r/>
+          </w:p>
+        </w:tc>
+        <w:tc>
+          <w:tcPr>
+            <w:tcW w:type="dxa" w:w="1530"/>
+          </w:tcPr>
+          <w:p>
+            <w:r>
+              <w:t>10:25-10:55</w:t>
+            </w:r>
+          </w:p>
+        </w:tc>
+      </w:tr>
+      <w:tr>
+        <w:tc>
+          <w:tcPr>
+            <w:tcW w:type="dxa" w:w="1530"/>
+          </w:tcPr>
+          <w:p>
+            <w:r>
+              <w:t>P5</w:t>
+            </w:r>
+          </w:p>
+        </w:tc>
+        <w:tc>
+          <w:tcPr>
+            <w:tcW w:type="dxa" w:w="1530"/>
+          </w:tcPr>
+          <w:p>
+            <w:r>
+              <w:t>11:20-12:00</w:t>
+            </w:r>
+          </w:p>
+        </w:tc>
+        <w:tc>
+          <w:tcPr>
+            <w:tcW w:type="dxa" w:w="1530"/>
+          </w:tcPr>
+          <w:p>
+            <w:r/>
+          </w:p>
+        </w:tc>
+        <w:tc>
+          <w:tcPr>
+            <w:tcW w:type="dxa" w:w="1530"/>
+          </w:tcPr>
+          <w:p>
+            <w:r/>
+          </w:p>
+        </w:tc>
+        <w:tc>
+          <w:tcPr>
+            <w:tcW w:type="dxa" w:w="1530"/>
           </w:tcPr>
           <w:p>
             <w:r>
@@ -172,7 +572,7 @@
         </w:tc>
         <w:tc>
           <w:tcPr>
-            <w:tcW w:type="dxa" w:w="1080"/>
+            <w:tcW w:type="dxa" w:w="1530"/>
           </w:tcPr>
           <w:p>
             <w:r/>
@@ -180,11 +580,19 @@
         </w:tc>
         <w:tc>
           <w:tcPr>
-            <w:tcW w:type="dxa" w:w="1080"/>
+            <w:tcW w:type="dxa" w:w="1530"/>
+          </w:tcPr>
+          <w:p>
+            <w:r/>
+          </w:p>
+        </w:tc>
+        <w:tc>
+          <w:tcPr>
+            <w:tcW w:type="dxa" w:w="1530"/>
           </w:tcPr>
           <w:p>
             <w:r>
-              <w:t>8:00-8:40</w:t>
+              <w:t>10:55-11:35</w:t>
             </w:r>
           </w:p>
         </w:tc>
@@ -192,131 +600,31 @@
       <w:tr>
         <w:tc>
           <w:tcPr>
-            <w:tcW w:type="dxa" w:w="1080"/>
+            <w:tcW w:type="dxa" w:w="1530"/>
           </w:tcPr>
           <w:p>
             <w:r>
-              <w:t>P2</w:t>
+              <w:t>P6</w:t>
             </w:r>
           </w:p>
         </w:tc>
         <w:tc>
           <w:tcPr>
-            <w:tcW w:type="dxa" w:w="1080"/>
+            <w:tcW w:type="dxa" w:w="1530"/>
           </w:tcPr>
           <w:p>
             <w:r>
-              <w:t>8:50-9:30</w:t>
+              <w:t>12:00-12:40</w:t>
             </w:r>
           </w:p>
         </w:tc>
         <w:tc>
           <w:tcPr>
-            <w:tcW w:type="dxa" w:w="1080"/>
-          </w:tcPr>
-          <w:p>
-            <w:r/>
-          </w:p>
-        </w:tc>
-        <w:tc>
-          <w:tcPr>
-            <w:tcW w:type="dxa" w:w="1080"/>
-          </w:tcPr>
-          <w:p>
-            <w:r/>
-          </w:p>
-        </w:tc>
-        <w:tc>
-          <w:tcPr>
-            <w:tcW w:type="dxa" w:w="1080"/>
-          </w:tcPr>
-          <w:p>
-            <w:r/>
-          </w:p>
-        </w:tc>
-        <w:tc>
-          <w:tcPr>
-            <w:tcW w:type="dxa" w:w="1080"/>
-          </w:tcPr>
-          <w:p>
-            <w:r/>
-          </w:p>
-        </w:tc>
-        <w:tc>
-          <w:tcPr>
-            <w:tcW w:type="dxa" w:w="1080"/>
+            <w:tcW w:type="dxa" w:w="1530"/>
           </w:tcPr>
           <w:p>
             <w:r>
               <w:t>7E</w:t>
-              <w:br/>
-              <w:t>ARABIC</w:t>
-            </w:r>
-          </w:p>
-        </w:tc>
-        <w:tc>
-          <w:tcPr>
-            <w:tcW w:type="dxa" w:w="1080"/>
-          </w:tcPr>
-          <w:p>
-            <w:r>
-              <w:t>8:40-9:15</w:t>
-            </w:r>
-          </w:p>
-        </w:tc>
-      </w:tr>
-      <w:tr>
-        <w:tc>
-          <w:tcPr>
-            <w:tcW w:type="dxa" w:w="1080"/>
-          </w:tcPr>
-          <w:p>
-            <w:r>
-              <w:t>P3</w:t>
-            </w:r>
-          </w:p>
-        </w:tc>
-        <w:tc>
-          <w:tcPr>
-            <w:tcW w:type="dxa" w:w="1080"/>
-          </w:tcPr>
-          <w:p>
-            <w:r>
-              <w:t>9:30-10:10</w:t>
-            </w:r>
-          </w:p>
-        </w:tc>
-        <w:tc>
-          <w:tcPr>
-            <w:tcW w:type="dxa" w:w="1080"/>
-          </w:tcPr>
-          <w:p>
-            <w:r/>
-          </w:p>
-        </w:tc>
-        <w:tc>
-          <w:tcPr>
-            <w:tcW w:type="dxa" w:w="1080"/>
-          </w:tcPr>
-          <w:p>
-            <w:r/>
-          </w:p>
-        </w:tc>
-        <w:tc>
-          <w:tcPr>
-            <w:tcW w:type="dxa" w:w="1080"/>
-          </w:tcPr>
-          <w:p>
-            <w:r/>
-          </w:p>
-        </w:tc>
-        <w:tc>
-          <w:tcPr>
-            <w:tcW w:type="dxa" w:w="1080"/>
-          </w:tcPr>
-          <w:p>
-            <w:r>
-              <w:t>6E</w:t>
               <w:br/>
               <w:t>ISLAMIAT</w:t>
             </w:r>
@@ -324,51 +632,11 @@
         </w:tc>
         <w:tc>
           <w:tcPr>
-            <w:tcW w:type="dxa" w:w="1080"/>
-          </w:tcPr>
-          <w:p>
-            <w:r/>
-          </w:p>
-        </w:tc>
-        <w:tc>
-          <w:tcPr>
-            <w:tcW w:type="dxa" w:w="1080"/>
+            <w:tcW w:type="dxa" w:w="1530"/>
           </w:tcPr>
           <w:p>
             <w:r>
-              <w:t>9:15-9:50</w:t>
-            </w:r>
-          </w:p>
-        </w:tc>
-      </w:tr>
-      <w:tr>
-        <w:tc>
-          <w:tcPr>
-            <w:tcW w:type="dxa" w:w="1080"/>
-          </w:tcPr>
-          <w:p>
-            <w:r>
-              <w:t>P4</w:t>
-            </w:r>
-          </w:p>
-        </w:tc>
-        <w:tc>
-          <w:tcPr>
-            <w:tcW w:type="dxa" w:w="1080"/>
-          </w:tcPr>
-          <w:p>
-            <w:r>
-              <w:t>10:10-10:50</w:t>
-            </w:r>
-          </w:p>
-        </w:tc>
-        <w:tc>
-          <w:tcPr>
-            <w:tcW w:type="dxa" w:w="1080"/>
-          </w:tcPr>
-          <w:p>
-            <w:r>
-              <w:t>6E</w:t>
+              <w:t>7E</w:t>
               <w:br/>
               <w:t>ISLAMIAT</w:t>
             </w:r>
@@ -376,7 +644,7 @@
         </w:tc>
         <w:tc>
           <w:tcPr>
-            <w:tcW w:type="dxa" w:w="1080"/>
+            <w:tcW w:type="dxa" w:w="1530"/>
           </w:tcPr>
           <w:p>
             <w:r>
@@ -388,7 +656,15 @@
         </w:tc>
         <w:tc>
           <w:tcPr>
-            <w:tcW w:type="dxa" w:w="1080"/>
+            <w:tcW w:type="dxa" w:w="1530"/>
+          </w:tcPr>
+          <w:p>
+            <w:r/>
+          </w:p>
+        </w:tc>
+        <w:tc>
+          <w:tcPr>
+            <w:tcW w:type="dxa" w:w="1530"/>
           </w:tcPr>
           <w:p>
             <w:r>
@@ -400,19 +676,47 @@
         </w:tc>
         <w:tc>
           <w:tcPr>
-            <w:tcW w:type="dxa" w:w="1080"/>
+            <w:tcW w:type="dxa" w:w="1530"/>
           </w:tcPr>
           <w:p>
             <w:r>
-              <w:t>7E</w:t>
-              <w:br/>
-              <w:t>ISLAMIAT</w:t>
+              <w:t>11:35-12:15</w:t>
+            </w:r>
+          </w:p>
+        </w:tc>
+      </w:tr>
+      <w:tr>
+        <w:tc>
+          <w:tcPr>
+            <w:tcW w:type="dxa" w:w="1530"/>
+          </w:tcPr>
+          <w:p>
+            <w:r>
+              <w:t>P7</w:t>
             </w:r>
           </w:p>
         </w:tc>
         <w:tc>
           <w:tcPr>
-            <w:tcW w:type="dxa" w:w="1080"/>
+            <w:tcW w:type="dxa" w:w="1530"/>
+          </w:tcPr>
+          <w:p>
+            <w:r>
+              <w:t>12:40-1:20</w:t>
+            </w:r>
+          </w:p>
+        </w:tc>
+        <w:tc>
+          <w:tcPr>
+            <w:tcW w:type="dxa" w:w="1530"/>
+          </w:tcPr>
+          <w:p>
+            <w:r/>
+          </w:p>
+        </w:tc>
+        <w:tc>
+          <w:tcPr>
+            <w:tcW w:type="dxa" w:w="1530"/>
           </w:tcPr>
           <w:p>
             <w:r>
@@ -424,39 +728,7 @@
         </w:tc>
         <w:tc>
           <w:tcPr>
-            <w:tcW w:type="dxa" w:w="1080"/>
-          </w:tcPr>
-          <w:p>
-            <w:r>
-              <w:t>9:50-10:25</w:t>
-            </w:r>
-          </w:p>
-        </w:tc>
-      </w:tr>
-      <w:tr>
-        <w:tc>
-          <w:tcPr>
-            <w:tcW w:type="dxa" w:w="1080"/>
-          </w:tcPr>
-          <w:p>
-            <w:r>
-              <w:t>P5</w:t>
-            </w:r>
-          </w:p>
-        </w:tc>
-        <w:tc>
-          <w:tcPr>
-            <w:tcW w:type="dxa" w:w="1080"/>
-          </w:tcPr>
-          <w:p>
-            <w:r>
-              <w:t>10:50-11:30</w:t>
-            </w:r>
-          </w:p>
-        </w:tc>
-        <w:tc>
-          <w:tcPr>
-            <w:tcW w:type="dxa" w:w="1080"/>
+            <w:tcW w:type="dxa" w:w="1530"/>
           </w:tcPr>
           <w:p>
             <w:r/>
@@ -464,7 +736,53 @@
         </w:tc>
         <w:tc>
           <w:tcPr>
-            <w:tcW w:type="dxa" w:w="1080"/>
+            <w:tcW w:type="dxa" w:w="1530"/>
+          </w:tcPr>
+          <w:p>
+            <w:r/>
+          </w:p>
+        </w:tc>
+        <w:tc>
+          <w:tcPr>
+            <w:tcW w:type="dxa" w:w="1530"/>
+          </w:tcPr>
+          <w:p>
+            <w:r/>
+          </w:p>
+        </w:tc>
+        <w:tc>
+          <w:tcPr>
+            <w:tcW w:type="dxa" w:w="1530"/>
+          </w:tcPr>
+          <w:p>
+            <w:r/>
+          </w:p>
+        </w:tc>
+      </w:tr>
+      <w:tr>
+        <w:tc>
+          <w:tcPr>
+            <w:tcW w:type="dxa" w:w="1530"/>
+          </w:tcPr>
+          <w:p>
+            <w:r>
+              <w:t>P8</w:t>
+            </w:r>
+          </w:p>
+        </w:tc>
+        <w:tc>
+          <w:tcPr>
+            <w:tcW w:type="dxa" w:w="1530"/>
+          </w:tcPr>
+          <w:p>
+            <w:r>
+              <w:t>1:20-2:00</w:t>
+            </w:r>
+          </w:p>
+        </w:tc>
+        <w:tc>
+          <w:tcPr>
+            <w:tcW w:type="dxa" w:w="1530"/>
           </w:tcPr>
           <w:p>
             <w:r>
@@ -476,165 +794,7 @@
         </w:tc>
         <w:tc>
           <w:tcPr>
-            <w:tcW w:type="dxa" w:w="1080"/>
-          </w:tcPr>
-          <w:p>
-            <w:r/>
-          </w:p>
-        </w:tc>
-        <w:tc>
-          <w:tcPr>
-            <w:tcW w:type="dxa" w:w="1080"/>
-          </w:tcPr>
-          <w:p>
-            <w:r/>
-          </w:p>
-        </w:tc>
-        <w:tc>
-          <w:tcPr>
-            <w:tcW w:type="dxa" w:w="1080"/>
-          </w:tcPr>
-          <w:p>
-            <w:r>
-              <w:t>Lunch</w:t>
-            </w:r>
-          </w:p>
-        </w:tc>
-        <w:tc>
-          <w:tcPr>
-            <w:tcW w:type="dxa" w:w="1080"/>
-          </w:tcPr>
-          <w:p>
-            <w:r>
-              <w:t>10:55-11:35</w:t>
-            </w:r>
-          </w:p>
-        </w:tc>
-      </w:tr>
-      <w:tr>
-        <w:tc>
-          <w:tcPr>
-            <w:tcW w:type="dxa" w:w="1080"/>
-          </w:tcPr>
-          <w:p>
-            <w:r>
-              <w:t>Lunch</w:t>
-            </w:r>
-          </w:p>
-        </w:tc>
-        <w:tc>
-          <w:tcPr>
-            <w:tcW w:type="dxa" w:w="1080"/>
-          </w:tcPr>
-          <w:p>
-            <w:r>
-              <w:t>11:30-12:00</w:t>
-            </w:r>
-          </w:p>
-        </w:tc>
-        <w:tc>
-          <w:tcPr>
-            <w:tcW w:type="dxa" w:w="1080"/>
-          </w:tcPr>
-          <w:p>
-            <w:r/>
-          </w:p>
-        </w:tc>
-        <w:tc>
-          <w:tcPr>
-            <w:tcW w:type="dxa" w:w="1080"/>
-          </w:tcPr>
-          <w:p>
-            <w:r/>
-          </w:p>
-        </w:tc>
-        <w:tc>
-          <w:tcPr>
-            <w:tcW w:type="dxa" w:w="1080"/>
-          </w:tcPr>
-          <w:p>
-            <w:r/>
-          </w:p>
-        </w:tc>
-        <w:tc>
-          <w:tcPr>
-            <w:tcW w:type="dxa" w:w="1080"/>
-          </w:tcPr>
-          <w:p>
-            <w:r/>
-          </w:p>
-        </w:tc>
-        <w:tc>
-          <w:tcPr>
-            <w:tcW w:type="dxa" w:w="1080"/>
-          </w:tcPr>
-          <w:p>
-            <w:r/>
-          </w:p>
-        </w:tc>
-        <w:tc>
-          <w:tcPr>
-            <w:tcW w:type="dxa" w:w="1080"/>
-          </w:tcPr>
-          <w:p>
-            <w:r>
-              <w:t>10:25-10:55</w:t>
-            </w:r>
-          </w:p>
-        </w:tc>
-      </w:tr>
-      <w:tr>
-        <w:tc>
-          <w:tcPr>
-            <w:tcW w:type="dxa" w:w="1080"/>
-          </w:tcPr>
-          <w:p>
-            <w:r>
-              <w:t>P6</w:t>
-            </w:r>
-          </w:p>
-        </w:tc>
-        <w:tc>
-          <w:tcPr>
-            <w:tcW w:type="dxa" w:w="1080"/>
-          </w:tcPr>
-          <w:p>
-            <w:r>
-              <w:t>12:00-12:40</w:t>
-            </w:r>
-          </w:p>
-        </w:tc>
-        <w:tc>
-          <w:tcPr>
-            <w:tcW w:type="dxa" w:w="1080"/>
-          </w:tcPr>
-          <w:p>
-            <w:r/>
-          </w:p>
-        </w:tc>
-        <w:tc>
-          <w:tcPr>
-            <w:tcW w:type="dxa" w:w="1080"/>
-          </w:tcPr>
-          <w:p>
-            <w:r>
-              <w:t>7B</w:t>
-              <w:br/>
-              <w:t>ARABIC</w:t>
-            </w:r>
-          </w:p>
-        </w:tc>
-        <w:tc>
-          <w:tcPr>
-            <w:tcW w:type="dxa" w:w="1080"/>
-          </w:tcPr>
-          <w:p>
-            <w:r/>
-          </w:p>
-        </w:tc>
-        <w:tc>
-          <w:tcPr>
-            <w:tcW w:type="dxa" w:w="1080"/>
+            <w:tcW w:type="dxa" w:w="1530"/>
           </w:tcPr>
           <w:p>
             <w:r>
@@ -646,7 +806,7 @@
         </w:tc>
         <w:tc>
           <w:tcPr>
-            <w:tcW w:type="dxa" w:w="1080"/>
+            <w:tcW w:type="dxa" w:w="1530"/>
           </w:tcPr>
           <w:p>
             <w:r/>
@@ -654,63 +814,7 @@
         </w:tc>
         <w:tc>
           <w:tcPr>
-            <w:tcW w:type="dxa" w:w="1080"/>
-          </w:tcPr>
-          <w:p>
-            <w:r>
-              <w:t>11:35-12:15</w:t>
-            </w:r>
-          </w:p>
-        </w:tc>
-      </w:tr>
-      <w:tr>
-        <w:tc>
-          <w:tcPr>
-            <w:tcW w:type="dxa" w:w="1080"/>
-          </w:tcPr>
-          <w:p>
-            <w:r>
-              <w:t>P7</w:t>
-            </w:r>
-          </w:p>
-        </w:tc>
-        <w:tc>
-          <w:tcPr>
-            <w:tcW w:type="dxa" w:w="1080"/>
-          </w:tcPr>
-          <w:p>
-            <w:r>
-              <w:t>12:40-1:20</w:t>
-            </w:r>
-          </w:p>
-        </w:tc>
-        <w:tc>
-          <w:tcPr>
-            <w:tcW w:type="dxa" w:w="1080"/>
-          </w:tcPr>
-          <w:p>
-            <w:r>
-              <w:t>7E</w:t>
-              <w:br/>
-              <w:t>ARABIC</w:t>
-            </w:r>
-          </w:p>
-        </w:tc>
-        <w:tc>
-          <w:tcPr>
-            <w:tcW w:type="dxa" w:w="1080"/>
-          </w:tcPr>
-          <w:p>
-            <w:r>
-              <w:t>7E</w:t>
-              <w:br/>
-              <w:t>ISLAMIAT</w:t>
-            </w:r>
-          </w:p>
-        </w:tc>
-        <w:tc>
-          <w:tcPr>
-            <w:tcW w:type="dxa" w:w="1080"/>
+            <w:tcW w:type="dxa" w:w="1530"/>
           </w:tcPr>
           <w:p>
             <w:r>
@@ -722,7 +826,7 @@
         </w:tc>
         <w:tc>
           <w:tcPr>
-            <w:tcW w:type="dxa" w:w="1080"/>
+            <w:tcW w:type="dxa" w:w="1530"/>
           </w:tcPr>
           <w:p>
             <w:r/>
@@ -730,89 +834,7 @@
         </w:tc>
         <w:tc>
           <w:tcPr>
-            <w:tcW w:type="dxa" w:w="1080"/>
-          </w:tcPr>
-          <w:p>
-            <w:r/>
-          </w:p>
-        </w:tc>
-        <w:tc>
-          <w:tcPr>
-            <w:tcW w:type="dxa" w:w="1080"/>
-          </w:tcPr>
-          <w:p>
-            <w:r/>
-          </w:p>
-        </w:tc>
-      </w:tr>
-      <w:tr>
-        <w:tc>
-          <w:tcPr>
-            <w:tcW w:type="dxa" w:w="1080"/>
-          </w:tcPr>
-          <w:p>
-            <w:r>
-              <w:t>P8</w:t>
-            </w:r>
-          </w:p>
-        </w:tc>
-        <w:tc>
-          <w:tcPr>
-            <w:tcW w:type="dxa" w:w="1080"/>
-          </w:tcPr>
-          <w:p>
-            <w:r>
-              <w:t>1:20-2:00</w:t>
-            </w:r>
-          </w:p>
-        </w:tc>
-        <w:tc>
-          <w:tcPr>
-            <w:tcW w:type="dxa" w:w="1080"/>
-          </w:tcPr>
-          <w:p>
-            <w:r>
-              <w:t>6E</w:t>
-              <w:br/>
-              <w:t>ISLAMIAT</w:t>
-            </w:r>
-          </w:p>
-        </w:tc>
-        <w:tc>
-          <w:tcPr>
-            <w:tcW w:type="dxa" w:w="1080"/>
-          </w:tcPr>
-          <w:p>
-            <w:r/>
-          </w:p>
-        </w:tc>
-        <w:tc>
-          <w:tcPr>
-            <w:tcW w:type="dxa" w:w="1080"/>
-          </w:tcPr>
-          <w:p>
-            <w:r/>
-          </w:p>
-        </w:tc>
-        <w:tc>
-          <w:tcPr>
-            <w:tcW w:type="dxa" w:w="1080"/>
-          </w:tcPr>
-          <w:p>
-            <w:r/>
-          </w:p>
-        </w:tc>
-        <w:tc>
-          <w:tcPr>
-            <w:tcW w:type="dxa" w:w="1080"/>
-          </w:tcPr>
-          <w:p>
-            <w:r/>
-          </w:p>
-        </w:tc>
-        <w:tc>
-          <w:tcPr>
-            <w:tcW w:type="dxa" w:w="1080"/>
+            <w:tcW w:type="dxa" w:w="1530"/>
           </w:tcPr>
           <w:p>
             <w:r/>
@@ -821,7 +843,7 @@
       </w:tr>
     </w:tbl>
     <w:sectPr>
-      <w:pgSz w:w="12240" w:h="15840"/>
+      <w:pgSz w:w="15840" w:h="12240" w:orient="landscape"/>
       <w:pgMar w:top="1440" w:right="1800" w:bottom="1440" w:left="1800" w:header="720" w:footer="720" w:gutter="0"/>
       <w:cols w:space="720"/>
       <w:docGrid w:linePitch="360"/>

</xml_diff>

<commit_message>
Updated login UI and fixed styles
</commit_message>
<xml_diff>
--- a/ABDUL SALAM_timetable.docx
+++ b/ABDUL SALAM_timetable.docx
@@ -195,11 +195,7 @@
             <w:tcW w:type="dxa" w:w="1530"/>
           </w:tcPr>
           <w:p>
-            <w:r>
-              <w:t>7E</w:t>
-              <w:br/>
-              <w:t>ARABIC</w:t>
-            </w:r>
+            <w:r/>
           </w:p>
         </w:tc>
         <w:tc>
@@ -283,7 +279,11 @@
             <w:tcW w:type="dxa" w:w="1530"/>
           </w:tcPr>
           <w:p>
-            <w:r/>
+            <w:r>
+              <w:t>7E</w:t>
+              <w:br/>
+              <w:t>ARABIC</w:t>
+            </w:r>
           </w:p>
         </w:tc>
         <w:tc>
@@ -323,11 +323,7 @@
             <w:tcW w:type="dxa" w:w="1530"/>
           </w:tcPr>
           <w:p>
-            <w:r>
-              <w:t>6E</w:t>
-              <w:br/>
-              <w:t>ARABIC</w:t>
-            </w:r>
+            <w:r/>
           </w:p>
         </w:tc>
         <w:tc>
@@ -711,7 +707,11 @@
             <w:tcW w:type="dxa" w:w="1530"/>
           </w:tcPr>
           <w:p>
-            <w:r/>
+            <w:r>
+              <w:t>6E</w:t>
+              <w:br/>
+              <w:t>ARABIC</w:t>
+            </w:r>
           </w:p>
         </w:tc>
         <w:tc>

</xml_diff>